<commit_message>
chore(informe): serie del saldo desde ICA + docx institucionales al día
- descargar_series.py: el sparkline del saldo comercial se deriva de las
  series ICA (expo − impo mensual, fresco a abr-2026); la serie directa
  164.3 quedaba 14 meses atrás del valor que ahora publica macro.py.
- Regenera los .docx institucionales desde sus .md (cinturon_macro con la
  metodología ITCM, doc maestro con la nota de jun-2026) y suma
  cinturon_espiritu_epoca al build (template/build_all_docx.ps1).

Co-Authored-By: Claude Fable 5 <noreply@anthropic.com>
</commit_message>
<xml_diff>
--- a/projects/informe_coyuntura/docs/260523_proyecto_pais_estado_extraccion.docx
+++ b/projects/informe_coyuntura/docs/260523_proyecto_pais_estado_extraccion.docx
@@ -69,6 +69,190 @@
       </w:r>
       <w:r>
         <w:t xml:space="preserve">documentar, para cada indicador enunciado en el documento base, su estado de implementación, la fuente real utilizada y, en los casos donde no fue posible automatizar, la razón técnica.</w:t>
+      </w:r>
+    </w:p>
+    <w:p>
+      <w:pPr>
+        <w:pStyle w:val="BlockText"/>
+      </w:pPr>
+      <w:r>
+        <w:rPr>
+          <w:bCs/>
+          <w:b/>
+        </w:rPr>
+        <w:t xml:space="preserve">Actualización (10 de junio de 2026):</w:t>
+      </w:r>
+      <w:r>
+        <w:t xml:space="preserve"> </w:t>
+      </w:r>
+      <w:r>
+        <w:t xml:space="preserve">dos documentos institucionales nuevos cambiaron la metodología.</w:t>
+      </w:r>
+      <w:r>
+        <w:t xml:space="preserve"> </w:t>
+      </w:r>
+      <w:r>
+        <w:t xml:space="preserve">1.</w:t>
+      </w:r>
+      <w:r>
+        <w:t xml:space="preserve"> </w:t>
+      </w:r>
+      <w:r>
+        <w:rPr>
+          <w:iCs/>
+          <w:i/>
+        </w:rPr>
+        <w:t xml:space="preserve">Fórmula Paramétrica — Cinturón de la Macroeconomía</w:t>
+      </w:r>
+      <w:r>
+        <w:t xml:space="preserve"> </w:t>
+      </w:r>
+      <w:r>
+        <w:t xml:space="preserve">(</w:t>
+      </w:r>
+      <w:r>
+        <w:rPr>
+          <w:rStyle w:val="VerbatimChar"/>
+        </w:rPr>
+        <w:t xml:space="preserve">260602 Parametrica Macro.docx</w:t>
+      </w:r>
+      <w:r>
+        <w:t xml:space="preserve">): el cinturón macro pasó a puntuarse con el</w:t>
+      </w:r>
+      <w:r>
+        <w:t xml:space="preserve"> </w:t>
+      </w:r>
+      <w:r>
+        <w:rPr>
+          <w:bCs/>
+          <w:b/>
+        </w:rPr>
+        <w:t xml:space="preserve">ITCM</w:t>
+      </w:r>
+      <w:r>
+        <w:t xml:space="preserve"> </w:t>
+      </w:r>
+      <w:r>
+        <w:t xml:space="preserve">(índice 0–100, 4 dimensiones ponderadas, 7 de los 11 indicadores; los otros 4 quedan como contexto). Detalle en</w:t>
+      </w:r>
+      <w:r>
+        <w:t xml:space="preserve"> </w:t>
+      </w:r>
+      <w:r>
+        <w:rPr>
+          <w:rStyle w:val="VerbatimChar"/>
+        </w:rPr>
+        <w:t xml:space="preserve">docs/cinturon_macro.md</w:t>
+      </w:r>
+      <w:r>
+        <w:t xml:space="preserve">.</w:t>
+      </w:r>
+      <w:r>
+        <w:t xml:space="preserve"> </w:t>
+      </w:r>
+      <w:r>
+        <w:t xml:space="preserve">2.</w:t>
+      </w:r>
+      <w:r>
+        <w:t xml:space="preserve"> </w:t>
+      </w:r>
+      <w:r>
+        <w:rPr>
+          <w:iCs/>
+          <w:i/>
+        </w:rPr>
+        <w:t xml:space="preserve">Marco Conceptual del Informe de Coyuntura</w:t>
+      </w:r>
+      <w:r>
+        <w:t xml:space="preserve"> </w:t>
+      </w:r>
+      <w:r>
+        <w:t xml:space="preserve">(</w:t>
+      </w:r>
+      <w:r>
+        <w:rPr>
+          <w:rStyle w:val="VerbatimChar"/>
+        </w:rPr>
+        <w:t xml:space="preserve">260606 MARCO CONCEPTUAL lINFORME DE COYUNTURA.docx</w:t>
+      </w:r>
+      <w:r>
+        <w:t xml:space="preserve">): se amplió de 4 a</w:t>
+      </w:r>
+      <w:r>
+        <w:t xml:space="preserve"> </w:t>
+      </w:r>
+      <w:r>
+        <w:rPr>
+          <w:bCs/>
+          <w:b/>
+        </w:rPr>
+        <w:t xml:space="preserve">5 cinturones</w:t>
+      </w:r>
+      <w:r>
+        <w:t xml:space="preserve"> </w:t>
+      </w:r>
+      <w:r>
+        <w:t xml:space="preserve">con</w:t>
+      </w:r>
+      <w:r>
+        <w:t xml:space="preserve"> </w:t>
+      </w:r>
+      <w:r>
+        <w:rPr>
+          <w:bCs/>
+          <w:b/>
+        </w:rPr>
+        <w:t xml:space="preserve">Espíritu de Época</w:t>
+      </w:r>
+      <w:r>
+        <w:t xml:space="preserve"> </w:t>
+      </w:r>
+      <w:r>
+        <w:t xml:space="preserve">(colector</w:t>
+      </w:r>
+      <w:r>
+        <w:t xml:space="preserve"> </w:t>
+      </w:r>
+      <w:r>
+        <w:rPr>
+          <w:rStyle w:val="VerbatimChar"/>
+        </w:rPr>
+        <w:t xml:space="preserve">scripts/espiritu_epoca.py</w:t>
+      </w:r>
+      <w:r>
+        <w:t xml:space="preserve">, 3 proxies v1: ICC UTDT, sentimiento digital, clima electoral del Votómetro). Detalle en</w:t>
+      </w:r>
+      <w:r>
+        <w:t xml:space="preserve"> </w:t>
+      </w:r>
+      <w:r>
+        <w:rPr>
+          <w:rStyle w:val="VerbatimChar"/>
+        </w:rPr>
+        <w:t xml:space="preserve">docs/cinturon_espiritu_epoca.md</w:t>
+      </w:r>
+      <w:r>
+        <w:t xml:space="preserve">.</w:t>
+      </w:r>
+    </w:p>
+    <w:p>
+      <w:pPr>
+        <w:pStyle w:val="BlockText"/>
+      </w:pPr>
+      <w:r>
+        <w:t xml:space="preserve">Los pesos del score global pasaron a macro 25% · política 25% · vida 20% · gestión 15% · espíritu 15% (provisionales,</w:t>
+      </w:r>
+      <w:r>
+        <w:t xml:space="preserve"> </w:t>
+      </w:r>
+      <w:r>
+        <w:rPr>
+          <w:rStyle w:val="VerbatimChar"/>
+        </w:rPr>
+        <w:t xml:space="preserve">config.py</w:t>
+      </w:r>
+      <w:r>
+        <w:t xml:space="preserve">). Las tablas de este documento describen el estado a mayo de 2026 y siguen siendo válidas para fuentes y extracción.</w:t>
       </w:r>
     </w:p>
     <w:p>

</xml_diff>

<commit_message>
feat(informe): ponderación de cinturones por fase del mandato
Implementa la ponderación temporal del Marco Conceptual (may-2026): en
los primeros 2-4 años de gobierno, gestión y espíritu de época pesan más
que en la consolidación. config.py define dos sets (fase temprana,
primeros 4 años: 20% parejo; consolidación: 25/25/20/15/15) y resuelve
por fecha contra MANDATO_INICIO (10-dic-2023). El informe expone fase y
pesos vigentes en el bloque `ponderacion` (schema 1.2.0). Los números
son operacionalización propia — el doc no los fija.

Co-Authored-By: Claude Fable 5 <noreply@anthropic.com>
</commit_message>
<xml_diff>
--- a/projects/informe_coyuntura/docs/260523_proyecto_pais_estado_extraccion.docx
+++ b/projects/informe_coyuntura/docs/260523_proyecto_pais_estado_extraccion.docx
@@ -240,10 +240,23 @@
         <w:pStyle w:val="BlockText"/>
       </w:pPr>
       <w:r>
-        <w:t xml:space="preserve">Los pesos del score global pasaron a macro 25% · política 25% · vida 20% · gestión 15% · espíritu 15% (provisionales,</w:t>
-      </w:r>
-      <w:r>
-        <w:t xml:space="preserve"> </w:t>
+        <w:t xml:space="preserve">Los pesos del score global son</w:t>
+      </w:r>
+      <w:r>
+        <w:t xml:space="preserve"> </w:t>
+      </w:r>
+      <w:r>
+        <w:rPr>
+          <w:bCs/>
+          <w:b/>
+        </w:rPr>
+        <w:t xml:space="preserve">por fase del mandato</w:t>
+      </w:r>
+      <w:r>
+        <w:t xml:space="preserve"> </w:t>
+      </w:r>
+      <w:r>
+        <w:t xml:space="preserve">(</w:t>
       </w:r>
       <w:r>
         <w:rPr>
@@ -252,7 +265,7 @@
         <w:t xml:space="preserve">config.py</w:t>
       </w:r>
       <w:r>
-        <w:t xml:space="preserve">). Las tablas de este documento describen el estado a mayo de 2026 y siguen siendo válidas para fuentes y extracción.</w:t>
+        <w:t xml:space="preserve">, según la ponderación temporal del Marco Conceptual): fase temprana (primeros 4 años) 20% parejo para los cinco; consolidación 25/25/20/15/15. Las tablas de este documento describen el estado a mayo de 2026 y siguen siendo válidas para fuentes y extracción.</w:t>
       </w:r>
     </w:p>
     <w:p>

</xml_diff>